<commit_message>
added calibration feature to init screen
</commit_message>
<xml_diff>
--- a/How to navigate AETS display menu.docx
+++ b/How to navigate AETS display menu.docx
@@ -2,26 +2,248 @@
 <file path=word/document.xml><?xml version="1.0" encoding="utf-8"?>
 <w:document xmlns:wpc="http://schemas.microsoft.com/office/word/2010/wordprocessingCanvas" xmlns:cx="http://schemas.microsoft.com/office/drawing/2014/chartex" xmlns:cx1="http://schemas.microsoft.com/office/drawing/2015/9/8/chartex" xmlns:cx2="http://schemas.microsoft.com/office/drawing/2015/10/21/chartex" xmlns:cx3="http://schemas.microsoft.com/office/drawing/2016/5/9/chartex" xmlns:cx4="http://schemas.microsoft.com/office/drawing/2016/5/10/chartex" xmlns:cx5="http://schemas.microsoft.com/office/drawing/2016/5/11/chartex" xmlns:cx6="http://schemas.microsoft.com/office/drawing/2016/5/12/chartex" xmlns:cx7="http://schemas.microsoft.com/office/drawing/2016/5/13/chartex" xmlns:cx8="http://schemas.microsoft.com/office/drawing/2016/5/14/chartex" xmlns:mc="http://schemas.openxmlformats.org/markup-compatibility/2006" xmlns:aink="http://schemas.microsoft.com/office/drawing/2016/ink" xmlns:am3d="http://schemas.microsoft.com/office/drawing/2017/model3d" xmlns:o="urn:schemas-microsoft-com:office:office" xmlns:oel="http://schemas.microsoft.com/office/2019/extlst" xmlns:r="http://schemas.openxmlformats.org/officeDocument/2006/relationships" xmlns:m="http://schemas.openxmlformats.org/officeDocument/2006/math" xmlns:v="urn:schemas-microsoft-com:vml" xmlns:wp14="http://schemas.microsoft.com/office/word/2010/wordprocessingDrawing" xmlns:wp="http://schemas.openxmlformats.org/drawingml/2006/wordprocessingDrawing" xmlns:w10="urn:schemas-microsoft-com:office:word" xmlns:w="http://schemas.openxmlformats.org/wordprocessingml/2006/main" xmlns:w14="http://schemas.microsoft.com/office/word/2010/wordml" xmlns:w15="http://schemas.microsoft.com/office/word/2012/wordml" xmlns:w16cex="http://schemas.microsoft.com/office/word/2018/wordml/cex" xmlns:w16cid="http://schemas.microsoft.com/office/word/2016/wordml/cid" xmlns:w16="http://schemas.microsoft.com/office/word/2018/wordml" xmlns:w16du="http://schemas.microsoft.com/office/word/2023/wordml/word16du" xmlns:w16sdtdh="http://schemas.microsoft.com/office/word/2020/wordml/sdtdatahash" xmlns:w16sdtfl="http://schemas.microsoft.com/office/word/2024/wordml/sdtformatlock" xmlns:w16se="http://schemas.microsoft.com/office/word/2015/wordml/symex" xmlns:wpg="http://schemas.microsoft.com/office/word/2010/wordprocessingGroup" xmlns:wpi="http://schemas.microsoft.com/office/word/2010/wordprocessingInk" xmlns:wne="http://schemas.microsoft.com/office/word/2006/wordml" xmlns:wps="http://schemas.microsoft.com/office/word/2010/wordprocessingShape" mc:Ignorable="w14 w15 w16se w16cid w16 w16cex w16sdtdh w16sdtfl w16du wp14">
   <w:body>
-    <w:p>
-      <w:pPr>
-        <w:pStyle w:val="Title"/>
-        <w:jc w:val="center"/>
-      </w:pPr>
-      <w:r>
-        <w:t>How to navigate AETS display menu</w:t>
-      </w:r>
-    </w:p>
-    <w:p>
-      <w:pPr>
-        <w:jc w:val="center"/>
-      </w:pPr>
-      <w:r>
-        <w:t>Vojtěch Míček</w:t>
-      </w:r>
-    </w:p>
-    <w:p/>
     <w:sdt>
       <w:sdtPr>
+        <w:id w:val="-1121925083"/>
+        <w:docPartObj>
+          <w:docPartGallery w:val="Cover Pages"/>
+          <w:docPartUnique/>
+        </w:docPartObj>
+      </w:sdtPr>
+      <w:sdtEndPr>
+        <w:rPr>
+          <w:rFonts w:eastAsiaTheme="minorEastAsia"/>
+          <w:kern w:val="0"/>
+          <w:sz w:val="22"/>
+          <w:szCs w:val="22"/>
+          <w14:ligatures w14:val="none"/>
+        </w:rPr>
+      </w:sdtEndPr>
+      <w:sdtContent>
+        <w:p>
+          <w:pPr>
+            <w:jc w:val="center"/>
+            <w:rPr>
+              <w:rStyle w:val="TitleChar"/>
+              <w:sz w:val="144"/>
+              <w:szCs w:val="144"/>
+            </w:rPr>
+          </w:pPr>
+          <w:r>
+            <w:rPr>
+              <w:rStyle w:val="TitleChar"/>
+              <w:sz w:val="144"/>
+              <w:szCs w:val="144"/>
+            </w:rPr>
+            <w:t>How to use AETS E-BOX</w:t>
+          </w:r>
+        </w:p>
+        <w:p>
+          <w:pPr>
+            <w:pStyle w:val="NoSpacing"/>
+            <w:spacing w:before="40" w:after="40"/>
+            <w:jc w:val="center"/>
+            <w:rPr>
+              <w:caps/>
+              <w:color w:val="501549" w:themeColor="accent5" w:themeShade="80"/>
+              <w:sz w:val="28"/>
+              <w:szCs w:val="28"/>
+            </w:rPr>
+          </w:pPr>
+          <w:r>
+            <w:rPr>
+              <w:caps/>
+              <w:color w:val="501549" w:themeColor="accent5" w:themeShade="80"/>
+              <w:sz w:val="28"/>
+              <w:szCs w:val="28"/>
+            </w:rPr>
+            <w:br/>
+          </w:r>
+          <w:r>
+            <w:rPr>
+              <w:caps/>
+              <w:color w:val="501549" w:themeColor="accent5" w:themeShade="80"/>
+              <w:sz w:val="28"/>
+              <w:szCs w:val="28"/>
+            </w:rPr>
+            <w:br/>
+          </w:r>
+          <w:r>
+            <w:rPr>
+              <w:caps/>
+              <w:noProof/>
+              <w:color w:val="501549" w:themeColor="accent5" w:themeShade="80"/>
+              <w:sz w:val="28"/>
+              <w:szCs w:val="28"/>
+            </w:rPr>
+            <w:drawing>
+              <wp:inline distT="0" distB="0" distL="0" distR="0" wp14:anchorId="0673FFF5" wp14:editId="1703166C">
+                <wp:extent cx="5991752" cy="3811531"/>
+                <wp:effectExtent l="0" t="0" r="9525" b="0"/>
+                <wp:docPr id="596393208" name="Picture 2"/>
+                <wp:cNvGraphicFramePr>
+                  <a:graphicFrameLocks xmlns:a="http://schemas.openxmlformats.org/drawingml/2006/main" noChangeAspect="1"/>
+                </wp:cNvGraphicFramePr>
+                <a:graphic xmlns:a="http://schemas.openxmlformats.org/drawingml/2006/main">
+                  <a:graphicData uri="http://schemas.openxmlformats.org/drawingml/2006/picture">
+                    <pic:pic xmlns:pic="http://schemas.openxmlformats.org/drawingml/2006/picture">
+                      <pic:nvPicPr>
+                        <pic:cNvPr id="0" name="Picture 2"/>
+                        <pic:cNvPicPr>
+                          <a:picLocks noChangeAspect="1" noChangeArrowheads="1"/>
+                        </pic:cNvPicPr>
+                      </pic:nvPicPr>
+                      <pic:blipFill>
+                        <a:blip r:embed="rId9" cstate="print">
+                          <a:extLst>
+                            <a:ext uri="{28A0092B-C50C-407E-A947-70E740481C1C}">
+                              <a14:useLocalDpi xmlns:a14="http://schemas.microsoft.com/office/drawing/2010/main" val="0"/>
+                            </a:ext>
+                          </a:extLst>
+                        </a:blip>
+                        <a:srcRect/>
+                        <a:stretch>
+                          <a:fillRect/>
+                        </a:stretch>
+                      </pic:blipFill>
+                      <pic:spPr bwMode="auto">
+                        <a:xfrm>
+                          <a:off x="0" y="0"/>
+                          <a:ext cx="6009985" cy="3823129"/>
+                        </a:xfrm>
+                        <a:prstGeom prst="rect">
+                          <a:avLst/>
+                        </a:prstGeom>
+                        <a:noFill/>
+                        <a:ln>
+                          <a:noFill/>
+                        </a:ln>
+                      </pic:spPr>
+                    </pic:pic>
+                  </a:graphicData>
+                </a:graphic>
+              </wp:inline>
+            </w:drawing>
+          </w:r>
+          <w:r>
+            <w:rPr>
+              <w:caps/>
+              <w:color w:val="501549" w:themeColor="accent5" w:themeShade="80"/>
+              <w:sz w:val="28"/>
+              <w:szCs w:val="28"/>
+            </w:rPr>
+            <w:br/>
+          </w:r>
+          <w:r>
+            <w:rPr>
+              <w:caps/>
+              <w:color w:val="501549" w:themeColor="accent5" w:themeShade="80"/>
+              <w:sz w:val="28"/>
+              <w:szCs w:val="28"/>
+            </w:rPr>
+            <w:br/>
+          </w:r>
+        </w:p>
+        <w:p>
+          <w:pPr>
+            <w:pStyle w:val="NoSpacing"/>
+            <w:spacing w:before="40" w:after="40"/>
+            <w:rPr>
+              <w:caps/>
+              <w:color w:val="501549" w:themeColor="accent5" w:themeShade="80"/>
+              <w:sz w:val="28"/>
+              <w:szCs w:val="28"/>
+            </w:rPr>
+          </w:pPr>
+          <w:r>
+            <w:rPr>
+              <w:caps/>
+              <w:color w:val="501549" w:themeColor="accent5" w:themeShade="80"/>
+              <w:sz w:val="28"/>
+              <w:szCs w:val="28"/>
+            </w:rPr>
+            <w:br/>
+          </w:r>
+          <w:sdt>
+            <w:sdtPr>
+              <w:rPr>
+                <w:caps/>
+                <w:color w:val="501549" w:themeColor="accent5" w:themeShade="80"/>
+                <w:sz w:val="28"/>
+                <w:szCs w:val="28"/>
+              </w:rPr>
+              <w:alias w:val="Subtitle"/>
+              <w:tag w:val=""/>
+              <w:id w:val="-2090151685"/>
+              <w:dataBinding w:prefixMappings="xmlns:ns0='http://purl.org/dc/elements/1.1/' xmlns:ns1='http://schemas.openxmlformats.org/package/2006/metadata/core-properties' " w:xpath="/ns1:coreProperties[1]/ns0:subject[1]" w:storeItemID="{6C3C8BC8-F283-45AE-878A-BAB7291924A1}"/>
+              <w:text/>
+            </w:sdtPr>
+            <w:sdtContent>
+              <w:r>
+                <w:rPr>
+                  <w:caps/>
+                  <w:color w:val="501549" w:themeColor="accent5" w:themeShade="80"/>
+                  <w:sz w:val="28"/>
+                  <w:szCs w:val="28"/>
+                </w:rPr>
+                <w:t>MICEK, VOJTECH</w:t>
+              </w:r>
+            </w:sdtContent>
+          </w:sdt>
+        </w:p>
+        <w:p>
+          <w:pPr>
+            <w:pStyle w:val="NoSpacing"/>
+            <w:spacing w:before="80" w:after="40"/>
+            <w:rPr>
+              <w:caps/>
+              <w:color w:val="A02B93" w:themeColor="accent5"/>
+              <w:sz w:val="24"/>
+              <w:szCs w:val="24"/>
+            </w:rPr>
+          </w:pPr>
+          <w:sdt>
+            <w:sdtPr>
+              <w:rPr>
+                <w:caps/>
+                <w:color w:val="A02B93" w:themeColor="accent5"/>
+                <w:sz w:val="24"/>
+                <w:szCs w:val="24"/>
+              </w:rPr>
+              <w:alias w:val="Author"/>
+              <w:tag w:val=""/>
+              <w:id w:val="-1536112409"/>
+              <w:dataBinding w:prefixMappings="xmlns:ns0='http://purl.org/dc/elements/1.1/' xmlns:ns1='http://schemas.openxmlformats.org/package/2006/metadata/core-properties' " w:xpath="/ns1:coreProperties[1]/ns0:creator[1]" w:storeItemID="{6C3C8BC8-F283-45AE-878A-BAB7291924A1}"/>
+              <w:text/>
+            </w:sdtPr>
+            <w:sdtContent>
+              <w:r>
+                <w:rPr>
+                  <w:caps/>
+                  <w:color w:val="A02B93" w:themeColor="accent5"/>
+                  <w:sz w:val="24"/>
+                  <w:szCs w:val="24"/>
+                </w:rPr>
+                <w:t>03.04.2026</w:t>
+              </w:r>
+            </w:sdtContent>
+          </w:sdt>
+          <w:r>
+            <w:br w:type="page"/>
+          </w:r>
+        </w:p>
+      </w:sdtContent>
+    </w:sdt>
+    <w:sdt>
+      <w:sdtPr>
+        <w:rPr>
+          <w:rFonts w:asciiTheme="minorHAnsi" w:eastAsiaTheme="minorHAnsi" w:hAnsiTheme="minorHAnsi" w:cstheme="minorBidi"/>
+          <w:color w:val="auto"/>
+          <w:kern w:val="2"/>
+          <w:sz w:val="24"/>
+          <w:szCs w:val="24"/>
+          <w14:ligatures w14:val="standardContextual"/>
+        </w:rPr>
         <w:id w:val="-900823159"/>
         <w:docPartObj>
           <w:docPartGallery w:val="Table of Contents"/>
@@ -30,15 +252,9 @@
       </w:sdtPr>
       <w:sdtEndPr>
         <w:rPr>
-          <w:rFonts w:asciiTheme="minorHAnsi" w:eastAsiaTheme="minorHAnsi" w:hAnsiTheme="minorHAnsi" w:cstheme="minorBidi"/>
           <w:b/>
           <w:bCs/>
           <w:noProof/>
-          <w:color w:val="auto"/>
-          <w:kern w:val="2"/>
-          <w:sz w:val="24"/>
-          <w:szCs w:val="24"/>
-          <w14:ligatures w14:val="standardContextual"/>
         </w:rPr>
       </w:sdtEndPr>
       <w:sdtContent>
@@ -1503,7 +1719,7 @@
                     </pic:cNvPicPr>
                   </pic:nvPicPr>
                   <pic:blipFill>
-                    <a:blip r:embed="rId8">
+                    <a:blip r:embed="rId10">
                       <a:extLst>
                         <a:ext uri="{28A0092B-C50C-407E-A947-70E740481C1C}">
                           <a14:useLocalDpi xmlns:a14="http://schemas.microsoft.com/office/drawing/2010/main" val="0"/>
@@ -1566,7 +1782,7 @@
                     </pic:cNvPicPr>
                   </pic:nvPicPr>
                   <pic:blipFill>
-                    <a:blip r:embed="rId9">
+                    <a:blip r:embed="rId11">
                       <a:extLst>
                         <a:ext uri="{28A0092B-C50C-407E-A947-70E740481C1C}">
                           <a14:useLocalDpi xmlns:a14="http://schemas.microsoft.com/office/drawing/2010/main" val="0"/>
@@ -1641,6 +1857,9 @@
         </w:rPr>
       </w:pPr>
       <w:r>
+        <w:rPr>
+          <w:noProof/>
+        </w:rPr>
         <w:drawing>
           <wp:inline distT="0" distB="0" distL="0" distR="0" wp14:anchorId="20B062C2" wp14:editId="31DA0352">
             <wp:extent cx="3762929" cy="276045"/>
@@ -1657,7 +1876,7 @@
                     <pic:cNvPicPr/>
                   </pic:nvPicPr>
                   <pic:blipFill>
-                    <a:blip r:embed="rId10"/>
+                    <a:blip r:embed="rId12"/>
                     <a:stretch>
                       <a:fillRect/>
                     </a:stretch>
@@ -1699,6 +1918,9 @@
     </w:p>
     <w:p>
       <w:r>
+        <w:rPr>
+          <w:noProof/>
+        </w:rPr>
         <w:drawing>
           <wp:inline distT="0" distB="0" distL="0" distR="0" wp14:anchorId="29B70C71" wp14:editId="2E3CD5E6">
             <wp:extent cx="5943600" cy="711835"/>
@@ -1715,7 +1937,7 @@
                     <pic:cNvPicPr/>
                   </pic:nvPicPr>
                   <pic:blipFill>
-                    <a:blip r:embed="rId11"/>
+                    <a:blip r:embed="rId13"/>
                     <a:stretch>
                       <a:fillRect/>
                     </a:stretch>
@@ -1760,10 +1982,7 @@
     </w:p>
     <w:p>
       <w:r>
-        <w:t xml:space="preserve">This is </w:t>
-      </w:r>
-      <w:r>
-        <w:t>the main screen of the menu. From here you can go to every sub-menu to set up tests, load profiles, set communication etc.</w:t>
+        <w:t>This is the main screen of the menu. From here you can go to every sub-menu to set up tests, load profiles, set communication etc.</w:t>
       </w:r>
     </w:p>
     <w:p>
@@ -1874,6 +2093,9 @@
     </w:p>
     <w:p>
       <w:r>
+        <w:rPr>
+          <w:noProof/>
+        </w:rPr>
         <w:drawing>
           <wp:inline distT="0" distB="0" distL="0" distR="0" wp14:anchorId="3E869AC7" wp14:editId="4CEC8D6C">
             <wp:extent cx="5943600" cy="1538605"/>
@@ -1890,7 +2112,7 @@
                     <pic:cNvPicPr/>
                   </pic:nvPicPr>
                   <pic:blipFill>
-                    <a:blip r:embed="rId12"/>
+                    <a:blip r:embed="rId14"/>
                     <a:stretch>
                       <a:fillRect/>
                     </a:stretch>
@@ -1929,6 +2151,9 @@
     </w:p>
     <w:p>
       <w:r>
+        <w:rPr>
+          <w:noProof/>
+        </w:rPr>
         <w:drawing>
           <wp:inline distT="0" distB="0" distL="0" distR="0" wp14:anchorId="5CE43F80" wp14:editId="0732CDF6">
             <wp:extent cx="5943600" cy="633730"/>
@@ -1945,7 +2170,7 @@
                     <pic:cNvPicPr/>
                   </pic:nvPicPr>
                   <pic:blipFill>
-                    <a:blip r:embed="rId13"/>
+                    <a:blip r:embed="rId15"/>
                     <a:stretch>
                       <a:fillRect/>
                     </a:stretch>
@@ -1986,6 +2211,9 @@
     </w:p>
     <w:p>
       <w:r>
+        <w:rPr>
+          <w:noProof/>
+        </w:rPr>
         <w:drawing>
           <wp:inline distT="0" distB="0" distL="0" distR="0" wp14:anchorId="6D3A66E2" wp14:editId="7644077D">
             <wp:extent cx="5943600" cy="1294130"/>
@@ -2002,7 +2230,7 @@
                     <pic:cNvPicPr/>
                   </pic:nvPicPr>
                   <pic:blipFill>
-                    <a:blip r:embed="rId14"/>
+                    <a:blip r:embed="rId16"/>
                     <a:stretch>
                       <a:fillRect/>
                     </a:stretch>
@@ -2040,6 +2268,9 @@
     </w:p>
     <w:p>
       <w:r>
+        <w:rPr>
+          <w:noProof/>
+        </w:rPr>
         <w:drawing>
           <wp:inline distT="0" distB="0" distL="0" distR="0" wp14:anchorId="54AC08E2" wp14:editId="221A6293">
             <wp:extent cx="5943600" cy="1320800"/>
@@ -2056,7 +2287,7 @@
                     <pic:cNvPicPr/>
                   </pic:nvPicPr>
                   <pic:blipFill>
-                    <a:blip r:embed="rId15"/>
+                    <a:blip r:embed="rId17"/>
                     <a:stretch>
                       <a:fillRect/>
                     </a:stretch>
@@ -2156,10 +2387,7 @@
         <w:t xml:space="preserve"> </w:t>
       </w:r>
       <w:r>
-        <w:t>[ 0 – 1000000]</w:t>
-      </w:r>
-      <w:r>
-        <w:t xml:space="preserve"> </w:t>
+        <w:t xml:space="preserve">[ 0 – 1000000] </w:t>
       </w:r>
     </w:p>
     <w:p>
@@ -2270,6 +2498,9 @@
     </w:p>
     <w:p>
       <w:r>
+        <w:rPr>
+          <w:noProof/>
+        </w:rPr>
         <w:drawing>
           <wp:inline distT="0" distB="0" distL="0" distR="0" wp14:anchorId="5465345C" wp14:editId="5E3CA54F">
             <wp:extent cx="5943600" cy="1320800"/>
@@ -2286,7 +2517,7 @@
                     <pic:cNvPicPr/>
                   </pic:nvPicPr>
                   <pic:blipFill>
-                    <a:blip r:embed="rId16"/>
+                    <a:blip r:embed="rId18"/>
                     <a:stretch>
                       <a:fillRect/>
                     </a:stretch>
@@ -2331,6 +2562,9 @@
     </w:p>
     <w:p>
       <w:r>
+        <w:rPr>
+          <w:noProof/>
+        </w:rPr>
         <w:drawing>
           <wp:inline distT="0" distB="0" distL="0" distR="0" wp14:anchorId="6D2E37EB" wp14:editId="7493539F">
             <wp:extent cx="5943600" cy="1425575"/>
@@ -2347,7 +2581,7 @@
                     <pic:cNvPicPr/>
                   </pic:nvPicPr>
                   <pic:blipFill>
-                    <a:blip r:embed="rId17"/>
+                    <a:blip r:embed="rId19"/>
                     <a:stretch>
                       <a:fillRect/>
                     </a:stretch>
@@ -2430,6 +2664,9 @@
     </w:p>
     <w:p>
       <w:r>
+        <w:rPr>
+          <w:noProof/>
+        </w:rPr>
         <w:drawing>
           <wp:inline distT="0" distB="0" distL="0" distR="0" wp14:anchorId="2AAA9FB7" wp14:editId="1A5DF4BF">
             <wp:extent cx="5943600" cy="660400"/>
@@ -2446,7 +2683,7 @@
                     <pic:cNvPicPr/>
                   </pic:nvPicPr>
                   <pic:blipFill>
-                    <a:blip r:embed="rId18"/>
+                    <a:blip r:embed="rId20"/>
                     <a:stretch>
                       <a:fillRect/>
                     </a:stretch>
@@ -2493,6 +2730,9 @@
     </w:p>
     <w:p>
       <w:r>
+        <w:rPr>
+          <w:noProof/>
+        </w:rPr>
         <w:drawing>
           <wp:inline distT="0" distB="0" distL="0" distR="0" wp14:anchorId="6DE2F22C" wp14:editId="5076E149">
             <wp:extent cx="5943600" cy="670560"/>
@@ -2509,7 +2749,7 @@
                     <pic:cNvPicPr/>
                   </pic:nvPicPr>
                   <pic:blipFill>
-                    <a:blip r:embed="rId19"/>
+                    <a:blip r:embed="rId21"/>
                     <a:stretch>
                       <a:fillRect/>
                     </a:stretch>
@@ -2560,6 +2800,9 @@
     </w:p>
     <w:p>
       <w:r>
+        <w:rPr>
+          <w:noProof/>
+        </w:rPr>
         <w:drawing>
           <wp:inline distT="0" distB="0" distL="0" distR="0" wp14:anchorId="4CE61AC4" wp14:editId="286794F9">
             <wp:extent cx="5943600" cy="1331595"/>
@@ -2576,7 +2819,7 @@
                     <pic:cNvPicPr/>
                   </pic:nvPicPr>
                   <pic:blipFill>
-                    <a:blip r:embed="rId20"/>
+                    <a:blip r:embed="rId22"/>
                     <a:stretch>
                       <a:fillRect/>
                     </a:stretch>
@@ -2643,10 +2886,7 @@
       </w:r>
       <w:proofErr w:type="spellEnd"/>
       <w:r>
-        <w:t xml:space="preserve"> </w:t>
-      </w:r>
-      <w:r>
-        <w:t>[ON|OFF]</w:t>
+        <w:t xml:space="preserve"> [ON|OFF]</w:t>
       </w:r>
     </w:p>
     <w:p>
@@ -2857,6 +3097,9 @@
     </w:p>
     <w:p>
       <w:r>
+        <w:rPr>
+          <w:noProof/>
+        </w:rPr>
         <w:drawing>
           <wp:inline distT="0" distB="0" distL="0" distR="0" wp14:anchorId="68A18E43" wp14:editId="13C01C58">
             <wp:extent cx="5943600" cy="1437640"/>
@@ -2873,7 +3116,7 @@
                     <pic:cNvPicPr/>
                   </pic:nvPicPr>
                   <pic:blipFill>
-                    <a:blip r:embed="rId21"/>
+                    <a:blip r:embed="rId23"/>
                     <a:stretch>
                       <a:fillRect/>
                     </a:stretch>
@@ -2903,10 +3146,7 @@
         </w:numPr>
       </w:pPr>
       <w:r>
-        <w:t xml:space="preserve">Remote Mode </w:t>
-      </w:r>
-      <w:r>
-        <w:t>[ON|OFF]</w:t>
+        <w:t>Remote Mode [ON|OFF]</w:t>
       </w:r>
     </w:p>
     <w:p>
@@ -2930,10 +3170,7 @@
         </w:numPr>
       </w:pPr>
       <w:r>
-        <w:t xml:space="preserve">CAN output </w:t>
-      </w:r>
-      <w:r>
-        <w:t>[ON|OFF]</w:t>
+        <w:t>CAN output [ON|OFF]</w:t>
       </w:r>
     </w:p>
     <w:p>
@@ -2957,10 +3194,7 @@
         </w:numPr>
       </w:pPr>
       <w:r>
-        <w:t xml:space="preserve">USB Output </w:t>
-      </w:r>
-      <w:r>
-        <w:t>[ON|OFF]</w:t>
+        <w:t>USB Output [ON|OFF]</w:t>
       </w:r>
     </w:p>
     <w:p>
@@ -2992,13 +3226,7 @@
       </w:r>
       <w:proofErr w:type="spellEnd"/>
       <w:r>
-        <w:t xml:space="preserve">) </w:t>
-      </w:r>
-      <w:r>
-        <w:t>[</w:t>
-      </w:r>
-      <w:r>
-        <w:t>200 -</w:t>
+        <w:t>) [200 -</w:t>
       </w:r>
       <w:r>
         <w:t xml:space="preserve"> 100000</w:t>
@@ -3039,6 +3267,9 @@
     </w:p>
     <w:p>
       <w:r>
+        <w:rPr>
+          <w:noProof/>
+        </w:rPr>
         <w:drawing>
           <wp:inline distT="0" distB="0" distL="0" distR="0" wp14:anchorId="23A655C9" wp14:editId="732F94BA">
             <wp:extent cx="5943600" cy="1467485"/>
@@ -3055,7 +3286,7 @@
                     <pic:cNvPicPr/>
                   </pic:nvPicPr>
                   <pic:blipFill>
-                    <a:blip r:embed="rId22"/>
+                    <a:blip r:embed="rId24"/>
                     <a:stretch>
                       <a:fillRect/>
                     </a:stretch>
@@ -3086,6 +3317,9 @@
     </w:p>
     <w:p>
       <w:r>
+        <w:rPr>
+          <w:noProof/>
+        </w:rPr>
         <w:drawing>
           <wp:inline distT="0" distB="0" distL="0" distR="0" wp14:anchorId="02C99985" wp14:editId="4B03F288">
             <wp:extent cx="5943600" cy="660400"/>
@@ -3102,7 +3336,7 @@
                     <pic:cNvPicPr/>
                   </pic:nvPicPr>
                   <pic:blipFill>
-                    <a:blip r:embed="rId23"/>
+                    <a:blip r:embed="rId25"/>
                     <a:stretch>
                       <a:fillRect/>
                     </a:stretch>
@@ -3141,6 +3375,9 @@
     </w:p>
     <w:p>
       <w:r>
+        <w:rPr>
+          <w:noProof/>
+        </w:rPr>
         <w:drawing>
           <wp:inline distT="0" distB="0" distL="0" distR="0" wp14:anchorId="26698E2C" wp14:editId="5FB7839B">
             <wp:extent cx="5943600" cy="648970"/>
@@ -3157,7 +3394,7 @@
                     <pic:cNvPicPr/>
                   </pic:nvPicPr>
                   <pic:blipFill>
-                    <a:blip r:embed="rId24"/>
+                    <a:blip r:embed="rId26"/>
                     <a:stretch>
                       <a:fillRect/>
                     </a:stretch>
@@ -3187,10 +3424,7 @@
         </w:numPr>
       </w:pPr>
       <w:r>
-        <w:t>Buzzer enable</w:t>
-      </w:r>
-      <w:r>
-        <w:t xml:space="preserve"> [ON|OFF]</w:t>
+        <w:t>Buzzer enable [ON|OFF]</w:t>
       </w:r>
     </w:p>
     <w:p>
@@ -3214,10 +3448,7 @@
         </w:numPr>
       </w:pPr>
       <w:r>
-        <w:t>Curr. monitor</w:t>
-      </w:r>
-      <w:r>
-        <w:t xml:space="preserve"> [ON|OFF]</w:t>
+        <w:t>Curr. monitor [ON|OFF]</w:t>
       </w:r>
     </w:p>
     <w:p>
@@ -3274,6 +3505,9 @@
     </w:p>
     <w:p>
       <w:r>
+        <w:rPr>
+          <w:noProof/>
+        </w:rPr>
         <w:drawing>
           <wp:inline distT="0" distB="0" distL="0" distR="0" wp14:anchorId="7CCD7D63" wp14:editId="407E9355">
             <wp:extent cx="5943600" cy="1478915"/>
@@ -3290,7 +3524,7 @@
                     <pic:cNvPicPr/>
                   </pic:nvPicPr>
                   <pic:blipFill>
-                    <a:blip r:embed="rId25"/>
+                    <a:blip r:embed="rId27"/>
                     <a:stretch>
                       <a:fillRect/>
                     </a:stretch>
@@ -3334,6 +3568,9 @@
     </w:p>
     <w:p>
       <w:r>
+        <w:rPr>
+          <w:noProof/>
+        </w:rPr>
         <w:drawing>
           <wp:inline distT="0" distB="0" distL="0" distR="0" wp14:anchorId="4E08777E" wp14:editId="3135F4E0">
             <wp:extent cx="5943600" cy="1453515"/>
@@ -3350,7 +3587,7 @@
                     <pic:cNvPicPr/>
                   </pic:nvPicPr>
                   <pic:blipFill>
-                    <a:blip r:embed="rId26"/>
+                    <a:blip r:embed="rId28"/>
                     <a:stretch>
                       <a:fillRect/>
                     </a:stretch>
@@ -3437,6 +3674,9 @@
     </w:p>
     <w:p>
       <w:r>
+        <w:rPr>
+          <w:noProof/>
+        </w:rPr>
         <w:drawing>
           <wp:inline distT="0" distB="0" distL="0" distR="0" wp14:anchorId="69D8A6E9" wp14:editId="37121E29">
             <wp:extent cx="5943600" cy="643255"/>
@@ -3453,7 +3693,7 @@
                     <pic:cNvPicPr/>
                   </pic:nvPicPr>
                   <pic:blipFill>
-                    <a:blip r:embed="rId27"/>
+                    <a:blip r:embed="rId29"/>
                     <a:stretch>
                       <a:fillRect/>
                     </a:stretch>
@@ -3497,6 +3737,9 @@
     </w:p>
     <w:p>
       <w:r>
+        <w:rPr>
+          <w:noProof/>
+        </w:rPr>
         <w:drawing>
           <wp:inline distT="0" distB="0" distL="0" distR="0" wp14:anchorId="1E376B8F" wp14:editId="7FE7E42D">
             <wp:extent cx="5943600" cy="1478915"/>
@@ -3513,7 +3756,7 @@
                     <pic:cNvPicPr/>
                   </pic:nvPicPr>
                   <pic:blipFill>
-                    <a:blip r:embed="rId28"/>
+                    <a:blip r:embed="rId30"/>
                     <a:stretch>
                       <a:fillRect/>
                     </a:stretch>
@@ -3630,6 +3873,9 @@
     </w:p>
     <w:p>
       <w:r>
+        <w:rPr>
+          <w:noProof/>
+        </w:rPr>
         <w:drawing>
           <wp:inline distT="0" distB="0" distL="0" distR="0" wp14:anchorId="25B49447" wp14:editId="7BE01F14">
             <wp:extent cx="5943600" cy="3297555"/>
@@ -3646,7 +3892,7 @@
                     <pic:cNvPicPr/>
                   </pic:nvPicPr>
                   <pic:blipFill>
-                    <a:blip r:embed="rId29"/>
+                    <a:blip r:embed="rId31"/>
                     <a:stretch>
                       <a:fillRect/>
                     </a:stretch>
@@ -3669,10 +3915,12 @@
     </w:p>
     <w:p/>
     <w:sectPr>
-      <w:footerReference w:type="default" r:id="rId30"/>
+      <w:footerReference w:type="default" r:id="rId32"/>
       <w:pgSz w:w="12240" w:h="15840"/>
       <w:pgMar w:top="1440" w:right="1440" w:bottom="1440" w:left="1440" w:header="708" w:footer="708" w:gutter="0"/>
+      <w:pgNumType w:start="0"/>
       <w:cols w:space="708"/>
+      <w:titlePg/>
       <w:docGrid w:linePitch="360"/>
     </w:sectPr>
   </w:body>
@@ -4770,7 +5018,7 @@
   <w:style w:type="paragraph" w:default="1" w:styleId="Normal">
     <w:name w:val="Normal"/>
     <w:qFormat/>
-    <w:rsid w:val="00CB19E5"/>
+    <w:rsid w:val="0049791C"/>
   </w:style>
   <w:style w:type="paragraph" w:styleId="Heading1">
     <w:name w:val="heading 1"/>
@@ -4974,6 +5222,7 @@
   <w:style w:type="character" w:default="1" w:styleId="DefaultParagraphFont">
     <w:name w:val="Default Paragraph Font"/>
     <w:uiPriority w:val="1"/>
+    <w:semiHidden/>
     <w:unhideWhenUsed/>
   </w:style>
   <w:style w:type="table" w:default="1" w:styleId="TableNormal">
@@ -5399,6 +5648,37 @@
     <w:uiPriority w:val="99"/>
     <w:rsid w:val="00CF565A"/>
   </w:style>
+  <w:style w:type="paragraph" w:styleId="NoSpacing">
+    <w:name w:val="No Spacing"/>
+    <w:link w:val="NoSpacingChar"/>
+    <w:uiPriority w:val="1"/>
+    <w:qFormat/>
+    <w:rsid w:val="0049791C"/>
+    <w:pPr>
+      <w:spacing w:after="0" w:line="240" w:lineRule="auto"/>
+    </w:pPr>
+    <w:rPr>
+      <w:rFonts w:eastAsiaTheme="minorEastAsia"/>
+      <w:kern w:val="0"/>
+      <w:sz w:val="22"/>
+      <w:szCs w:val="22"/>
+      <w14:ligatures w14:val="none"/>
+    </w:rPr>
+  </w:style>
+  <w:style w:type="character" w:customStyle="1" w:styleId="NoSpacingChar">
+    <w:name w:val="No Spacing Char"/>
+    <w:basedOn w:val="DefaultParagraphFont"/>
+    <w:link w:val="NoSpacing"/>
+    <w:uiPriority w:val="1"/>
+    <w:rsid w:val="0049791C"/>
+    <w:rPr>
+      <w:rFonts w:eastAsiaTheme="minorEastAsia"/>
+      <w:kern w:val="0"/>
+      <w:sz w:val="22"/>
+      <w:szCs w:val="22"/>
+      <w14:ligatures w14:val="none"/>
+    </w:rPr>
+  </w:style>
 </w:styles>
 </file>
 
@@ -5698,10 +5978,29 @@
 </file>
 
 <file path=customXml/item1.xml><?xml version="1.0" encoding="utf-8"?>
+<CoverPageProperties xmlns="http://schemas.microsoft.com/office/2006/coverPageProps">
+  <PublishDate>2026</PublishDate>
+  <Abstract/>
+  <CompanyAddress/>
+  <CompanyPhone/>
+  <CompanyFax/>
+  <CompanyEmail/>
+</CoverPageProperties>
+</file>
+
+<file path=customXml/item2.xml><?xml version="1.0" encoding="utf-8"?>
 <b:Sources xmlns:b="http://schemas.openxmlformats.org/officeDocument/2006/bibliography" xmlns="http://schemas.openxmlformats.org/officeDocument/2006/bibliography" SelectedStyle="\APASixthEditionOfficeOnline.xsl" StyleName="APA" Version="6"/>
 </file>
 
 <file path=customXml/itemProps1.xml><?xml version="1.0" encoding="utf-8"?>
+<ds:datastoreItem xmlns:ds="http://schemas.openxmlformats.org/officeDocument/2006/customXml" ds:itemID="{55AF091B-3C7A-41E3-B477-F2FDAA23CFDA}">
+  <ds:schemaRefs>
+    <ds:schemaRef ds:uri="http://schemas.microsoft.com/office/2006/coverPageProps"/>
+  </ds:schemaRefs>
+</ds:datastoreItem>
+</file>
+
+<file path=customXml/itemProps2.xml><?xml version="1.0" encoding="utf-8"?>
 <ds:datastoreItem xmlns:ds="http://schemas.openxmlformats.org/officeDocument/2006/customXml" ds:itemID="{0D0494BA-BBDB-4026-875B-E8B7433D0739}">
   <ds:schemaRefs>
     <ds:schemaRef ds:uri="http://schemas.openxmlformats.org/officeDocument/2006/bibliography"/>
@@ -5711,6 +6010,6 @@
 
 <file path=docMetadata/LabelInfo.xml><?xml version="1.0" encoding="utf-8"?>
 <clbl:labelList xmlns:clbl="http://schemas.microsoft.com/office/2020/mipLabelMetadata">
-  <clbl:label id="{39b77101-99b7-41c9-8d6a-7794b9d48476}" enabled="0" method="" siteId="{39b77101-99b7-41c9-8d6a-7794b9d48476}" removed="1"/>
+  <clbl:label id="{3f3ac890-09a1-47d3-8d04-15427d7fec91}" enabled="1" method="Standard" siteId="{39b77101-99b7-41c9-8d6a-7794b9d48476}" removed="0"/>
 </clbl:labelList>
 </file>
</xml_diff>